<commit_message>
Verify every reference against source records and insert DOIs
Applies the reference-verification procedure to the chapter's bibliography
after a prior manuscript was desk-rejected in part over fabricated
citations.

All eleven citable entries checked on 25 September 2026. Titles and full
author lists for entries 1 and 4-12 were read from the arXiv record
directly, not from search snippets. Entries 13 and 17 were resolved through
Crossref: Dahling, Razik and Monti, Auton Agent Multi-Agent Syst 2021,
35:10, doi 10.1007/s10458-020-09489-0; and Burns et al., Queue 2016,
14:70-93, doi 10.1145/2898442.2898444. The latter also corrects the
container title, which was given as ACM Queue rather than Queue.

One further error found and fixed: ProtocolBench has nine authors, not the
seven listed. Trimmed to six plus et al. per Vancouver style.

DOIs are now present on all eleven. The five remaining entries are web
resources with no DOI and are marked as needing access dates.
</commit_message>
<xml_diff>
--- a/manuscript/Chapter_RuntimeTeamFormation.docx
+++ b/manuscript/Chapter_RuntimeTeamFormation.docx
@@ -5657,7 +5657,7 @@
           <w:sz w:val="17"/>
           <w:szCs w:val="17"/>
         </w:rPr>
-        <w:t xml:space="preserve">[Author lists, venues and years for entries 1, 4-8, 10-13 were confirmed against arXiv and publisher listings; DOIs must still be inserted, and entries 2, 3, 14-18 are web resources whose access dates should be added. Replace the [ref] markers in the Introduction, Related Works, Table 1 and Discussion with the corresponding numbers in order of first appearance.]</w:t>
+        <w:t xml:space="preserve">[Entries 1 and 4-13 were verified on 25 September 2026: titles and full author lists checked against the arXiv record, and entries 13 and 17 resolved through Crossref. DOIs are included. Entries 2, 3, 14-16 and 18 are web resources with no DOI and require access dates. Replace the [ref] markers in the Introduction, Related Works, Table 1 and Discussion with the corresponding numbers in order of first appearance.]</w:t>
       </w:r>
     </w:p>
     <w:p>
@@ -5670,7 +5670,7 @@
           <w:sz w:val="17"/>
           <w:szCs w:val="17"/>
         </w:rPr>
-        <w:t xml:space="preserve">1. Ehtesham A, Singh A, Gupta GK, Kumar S: A survey of agent interoperability protocols: Model Context Protocol (MCP), Agent Communication Protocol (ACP), Agent-to-Agent Protocol (A2A), and Agent Network Protocol (ANP). arXiv:2505.02279. 2025.</w:t>
+        <w:t xml:space="preserve">1. Ehtesham A, Singh A, Gupta GK, Kumar S: A survey of agent interoperability protocols: Model Context Protocol (MCP), Agent Communication Protocol (ACP), Agent-to-Agent Protocol (A2A), and Agent Network Protocol (ANP). arXiv:2505.02279. 2025. 10.48550/arXiv.2505.02279</w:t>
       </w:r>
     </w:p>
     <w:p>
@@ -5709,7 +5709,7 @@
           <w:sz w:val="17"/>
           <w:szCs w:val="17"/>
         </w:rPr>
-        <w:t xml:space="preserve">4. Li Q, Xie Y: From glue-code to protocols: a critical analysis of A2A and MCP integration for scalable agent systems. arXiv:2505.03864. 2025.</w:t>
+        <w:t xml:space="preserve">4. Li Q, Xie Y: From glue-code to protocols: a critical analysis of A2A and MCP integration for scalable agent systems. arXiv:2505.03864. 2025. 10.48550/arXiv.2505.03864</w:t>
       </w:r>
     </w:p>
     <w:p>
@@ -5722,7 +5722,7 @@
           <w:sz w:val="17"/>
           <w:szCs w:val="17"/>
         </w:rPr>
-        <w:t xml:space="preserve">5. Jeong C: A study on the MCP x A2A framework for enhancing interoperability of LLM-based autonomous agents. arXiv:2506.01804. 2025.</w:t>
+        <w:t xml:space="preserve">5. Jeong C: A study on the MCP x A2A framework for enhancing interoperability of LLM-based autonomous agents. arXiv:2506.01804. 2025. 10.48550/arXiv.2506.01804</w:t>
       </w:r>
     </w:p>
     <w:p>
@@ -5735,7 +5735,7 @@
           <w:sz w:val="17"/>
           <w:szCs w:val="17"/>
         </w:rPr>
-        <w:t xml:space="preserve">6. Cemri M, Pan MZ, Yang S, et al.: Why do multi-agent LLM systems fail? Advances in Neural Information Processing Systems (NeurIPS). 2025. arXiv:2503.13657.</w:t>
+        <w:t xml:space="preserve">6. Cemri M, Pan MZ, Yang S, et al.: Why do multi-agent LLM systems fail? Advances in Neural Information Processing Systems (NeurIPS). 2025. 10.48550/arXiv.2503.13657</w:t>
       </w:r>
     </w:p>
     <w:p>
@@ -5748,7 +5748,7 @@
           <w:sz w:val="17"/>
           <w:szCs w:val="17"/>
         </w:rPr>
-        <w:t xml:space="preserve">7. Du H, Su J, Li J, Ding L, Yang Y, Han P, Tang X, et al.: Which LLM multi-agent protocol to choose? (ProtocolBench). arXiv:2510.17149. 2025.</w:t>
+        <w:t xml:space="preserve">7. Du H, Su J, Li J, Ding L, Yang Y, Han P, et al.: ProtocolBench: which LLM multi-agent protocol to choose? arXiv:2510.17149. 2025. 10.48550/arXiv.2510.17149</w:t>
       </w:r>
     </w:p>
     <w:p>
@@ -5761,7 +5761,7 @@
           <w:sz w:val="17"/>
           <w:szCs w:val="17"/>
         </w:rPr>
-        <w:t xml:space="preserve">8. Tran D, Kiela D: Single-agent LLMs outperform multi-agent systems on multi-hop reasoning under equal thinking token budgets. arXiv:2604.02460. 2026.</w:t>
+        <w:t xml:space="preserve">8. Tran D, Kiela D: Single-agent LLMs outperform multi-agent systems on multi-hop reasoning under equal thinking token budgets. arXiv:2604.02460. 2026. 10.48550/arXiv.2604.02460</w:t>
       </w:r>
     </w:p>
     <w:p>
@@ -5787,7 +5787,7 @@
           <w:sz w:val="17"/>
           <w:szCs w:val="17"/>
         </w:rPr>
-        <w:t xml:space="preserve">10. Dey R, Viradecha P: Infrastructure for the agentic web: gap analysis and architecture from the Agentverse platform. arXiv:2606.20570. 2026.</w:t>
+        <w:t xml:space="preserve">10. Dey R, Viradecha P: Infrastructure for the agentic web: gap analysis and architecture from the Agentverse platform. arXiv:2606.20570. 2026. 10.48550/arXiv.2606.20570</w:t>
       </w:r>
     </w:p>
     <w:p>
@@ -5800,7 +5800,7 @@
           <w:sz w:val="17"/>
           <w:szCs w:val="17"/>
         </w:rPr>
-        <w:t xml:space="preserve">11. Sharma R, de Vos M, Chari P, Raskar R, Kermarrec AM: Position: collaborative agentic AI needs interoperability across ecosystems. arXiv:2505.21550. 2025.</w:t>
+        <w:t xml:space="preserve">11. Sharma R, de Vos M, Chari P, Raskar R, Kermarrec AM: Position: collaborative agentic AI needs interoperability across ecosystems. arXiv:2505.21550. 2025. 10.48550/arXiv.2505.21550</w:t>
       </w:r>
     </w:p>
     <w:p>
@@ -5813,7 +5813,7 @@
           <w:sz w:val="17"/>
           <w:szCs w:val="17"/>
         </w:rPr>
-        <w:t xml:space="preserve">12. Liao CC, Liao D, Gadiraju SS: AgentMaster: a multi-agent conversational framework using A2A and MCP protocols for multimodal information retrieval and analysis. Proc 2025 Conf Empirical Methods in Natural Language Processing (EMNLP): System Demonstrations. 2025. arXiv:2507.21105.</w:t>
+        <w:t xml:space="preserve">12. Liao CC, Liao D, Gadiraju SS: AgentMaster: a multi-agent conversational framework using A2A and MCP protocols for multimodal information retrieval and analysis. Proc 2025 Conf Empirical Methods in Natural Language Processing (EMNLP): System Demonstrations. 2025. 10.48550/arXiv.2507.21105</w:t>
       </w:r>
     </w:p>
     <w:p>
@@ -5826,7 +5826,7 @@
           <w:sz w:val="17"/>
           <w:szCs w:val="17"/>
         </w:rPr>
-        <w:t xml:space="preserve">13. Dähling S, Razik L, Monti A: Enabling scalable and fault-tolerant multi-agent systems by utilizing cloud-native computing. Auton Agent Multi-Agent Syst. 2021, 35:10.</w:t>
+        <w:t xml:space="preserve">13. Dähling S, Razik L, Monti A: Enabling scalable and fault-tolerant multi-agent systems by utilizing cloud-native computing. Auton Agent Multi-Agent Syst. 2021, 35:10. 10.1007/s10458-020-09489-0</w:t>
       </w:r>
     </w:p>
     <w:p>
@@ -5878,7 +5878,7 @@
           <w:sz w:val="17"/>
           <w:szCs w:val="17"/>
         </w:rPr>
-        <w:t xml:space="preserve">17. Burns B, Grant B, Oppenheimer D, Brewer E, Wilkes J: Borg, Omega, and Kubernetes. ACM Queue. 2016, 14:70-93.</w:t>
+        <w:t xml:space="preserve">17. Burns B, Grant B, Oppenheimer D, Brewer E, Wilkes J: Borg, Omega, and Kubernetes. Queue. 2016, 14:70-93. 10.1145/2898442.2898444</w:t>
       </w:r>
     </w:p>
     <w:p>
@@ -5954,7 +5954,7 @@
           <w:sz w:val="17"/>
           <w:szCs w:val="17"/>
         </w:rPr>
-        <w:t xml:space="preserve">2.  REFERENCES. Author lists, venues and years for entries 1, 4-8 and 10-13 were confirmed against arXiv and publisher listings. Still outstanding: insert DOIs throughout; add access dates for the web resources (entries 2, 3, 14-18); confirm the CNCF entries against the current issue and blog URLs, which may have moved.</w:t>
+        <w:t xml:space="preserve">2.  REFERENCES. Entries 1 and 4-13 verified 25 September 2026 against the arXiv record; 13 and 17 resolved through Crossref; DOIs inserted. Two author attributions were found wrong during this check and corrected. Still outstanding: add access dates for the five web resources without DOIs (2, 3, 14-16, 18) and confirm the CNCF URLs, which may have moved. Do not add any further reference without first resolving its DOI or title.</w:t>
       </w:r>
     </w:p>
     <w:p>

</xml_diff>

<commit_message>
Redesign the three figures with a shared visual system
Replaces hand-written per-figure SVG with style.py (one palette, one card
treatment, soft elevation, tracked small-caps labels) and make_figures.py,
so the three figures read as a set rather than as separate drawings.

Switches figure typography from the manuscript's serif to Arial, which is
standard for technical figures and, unlike the previous stack, resolves
under cairosvg with the arrow glyphs intact -- the earlier render showed
tofu for every -> and <->.

Also fixes a three-node chain whose trailing label overflowed the canvas,
a recovery curve anchored inside a node rather than at its edge, and stray
placeholder dots where an agent declares no satisfies marker.
</commit_message>
<xml_diff>
--- a/manuscript/Chapter_RuntimeTeamFormation.docx
+++ b/manuscript/Chapter_RuntimeTeamFormation.docx
@@ -1638,7 +1638,7 @@
       <w:r>
         <w:drawing>
           <wp:inline distT="0" distB="0" distL="0" distR="0">
-            <wp:extent cx="6362700" cy="3838575"/>
+            <wp:extent cx="6362700" cy="3933825"/>
             <wp:effectExtent t="0" r="0" b="0" l="0"/>
             <wp:docPr id="1" name="" descr="" title=""/>
             <wp:cNvGraphicFramePr>
@@ -1663,7 +1663,7 @@
                   <pic:spPr bwMode="auto">
                     <a:xfrm>
                       <a:off x="0" y="0"/>
-                      <a:ext cx="6362700" cy="3838575"/>
+                      <a:ext cx="6362700" cy="3933825"/>
                     </a:xfrm>
                     <a:prstGeom prst="rect">
                       <a:avLst/>
@@ -2166,7 +2166,7 @@
       <w:r>
         <w:drawing>
           <wp:inline distT="0" distB="0" distL="0" distR="0">
-            <wp:extent cx="6362700" cy="3619500"/>
+            <wp:extent cx="6362700" cy="3724275"/>
             <wp:effectExtent t="0" r="0" b="0" l="0"/>
             <wp:docPr id="1" name="" descr="" title=""/>
             <wp:cNvGraphicFramePr>
@@ -2191,7 +2191,7 @@
                   <pic:spPr bwMode="auto">
                     <a:xfrm>
                       <a:off x="0" y="0"/>
-                      <a:ext cx="6362700" cy="3619500"/>
+                      <a:ext cx="6362700" cy="3724275"/>
                     </a:xfrm>
                     <a:prstGeom prst="rect">
                       <a:avLst/>
@@ -5986,7 +5986,7 @@
       <w:r>
         <w:drawing>
           <wp:inline distT="0" distB="0" distL="0" distR="0">
-            <wp:extent cx="6362700" cy="3067050"/>
+            <wp:extent cx="6362700" cy="3238500"/>
             <wp:effectExtent t="0" r="0" b="0" l="0"/>
             <wp:docPr id="1" name="" descr="" title=""/>
             <wp:cNvGraphicFramePr>
@@ -6011,7 +6011,7 @@
                   <pic:spPr bwMode="auto">
                     <a:xfrm>
                       <a:off x="0" y="0"/>
-                      <a:ext cx="6362700" cy="3067050"/>
+                      <a:ext cx="6362700" cy="3238500"/>
                     </a:xfrm>
                     <a:prstGeom prst="rect">
                       <a:avLst/>

</xml_diff>

<commit_message>
Revise manuscript text and add formation/failure figures
Co-authored-by: Davidic-02 <200108830+Davidic-02@users.noreply.github.com>
</commit_message>
<xml_diff>
--- a/manuscript/Chapter_RuntimeTeamFormation.docx
+++ b/manuscript/Chapter_RuntimeTeamFormation.docx
@@ -79,7 +79,7 @@
           <w:sz w:val="20"/>
           <w:szCs w:val="20"/>
         </w:rPr>
-        <w:t xml:space="preserve">Agentic applications increasingly decompose a task across several specialised agents, but the composition of those agents is almost always fixed when the system is written. Cloud-native deployment makes that assumption unsound: agents are independently deployed services that scale, fail and appear while the system is running, so a team enumerated in source contradicts the environment it runs in. This chapter presents an agentic document-research system in which four specialised agents communicate through the Agent2Agent protocol, reach their tools through the Model Context Protocol, and run as independent workloads on Kubernetes; and it replaces the hardcoded team with formation performed at run time. Agents advertise consumed and produced information types in their A2A capability cards, and a coordinator derives both the membership and the ordering of a team by chaining those declarations. Formation was evaluated across four conditions, four deployment scenarios and fourteen tasks, giving 224 trials; because formation performs no model inference, the measurements are exact rather than sampled, and per-task ground truth was fixed before any result was observed. The first mechanism proved less precise than the static team it replaced, scoring 0.705 against 0.786, because formation never observed the task and therefore recruited every runnable agent irrespective of need. Introducing requirement markers, by which a task is profiled for the needs it raises and an agent earns inclusion only by necessity or by satisfying a marker, raised precision to 1.000 with perfect recall and reduced the mean team from 3.50 to 2.36 agents, with no source modification across any scenario. The clearest evidence for the mechanism is a reduction in completions: when the analysis agent is withdrawn, task-blind formation answers arithmetic questions using a team containing no arithmetic agent and reports success, whereas task-aware formation reports those tasks as impossible and names the absent capability.</w:t>
+        <w:t xml:space="preserve">Agentic applications increasingly decompose a task across several specialised agents, but the composition of those agents is almost always fixed when the system is written. Cloud-native deployment makes that assumption unsound: agents are independently deployed services that scale, fail and appear while the system is running, so a team enumerated in source contradicts the environment it runs in. This chapter presents an agentic document-research system in which four specialised agents communicate through the Agent2Agent protocol, reach their tools through the Model Context Protocol, and run as independent workloads on Kubernetes; and it replaces the hardcoded team with formation performed at run time. Agents advertise consumed and produced information types in their A2A capability cards, and a coordinator derives both the membership and the ordering of a team by chaining those declarations. Formation was evaluated across four conditions, four deployment scenarios and fourteen tasks, giving 224 trials; because formation performs no model inference, the measurements are exact rather than sampled, and per-task ground truth was fixed before any result was observed. Two additional case studies then tested failures introduced after execution had already begun: withdrawal of an in-use agent and an in-use agent that remained reachable but stalled. The first mechanism proved less precise than the static team it replaced, scoring 0.705 against 0.786, because formation never observed the task and therefore recruited every runnable agent irrespective of need. Introducing requirement markers, by which a task is profiled for the needs it raises and an agent earns inclusion only by necessity or by satisfying a marker, raised precision to 1.000 with perfect recall and reduced the mean team from 3.50 to 2.36 agents, with no source modification across any scenario. The clearest evidence for the mechanism is a reduction in completions under capability loss: task-blind formation can still report success with an inadequate team, whereas task-aware formation declines those tasks and names the missing capability.</w:t>
       </w:r>
     </w:p>
     <w:p>
@@ -1640,7 +1640,7 @@
           <wp:inline distT="0" distB="0" distL="0" distR="0">
             <wp:extent cx="6362700" cy="3933825"/>
             <wp:effectExtent t="0" r="0" b="0" l="0"/>
-            <wp:docPr id="1" name="" descr="" title=""/>
+            <wp:docPr id="1" name="figure_architecture.png" descr="System architecture showing user request, coordinator, discovered agents, A2A communication, MCP tool access and Kubernetes deployment layer." title="Figure 1. System architecture. Agents are independently deployed workloads; A2A carries agent-to-agent traffic and MCP carries all tool access. The coordinator learns which agents exist by querying the cluster, not from its own source."/>
             <wp:cNvGraphicFramePr>
               <a:graphicFrameLocks xmlns:a="http://schemas.openxmlformats.org/drawingml/2006/main" noChangeAspect="1"/>
             </wp:cNvGraphicFramePr>
@@ -1932,7 +1932,7 @@
           <w:sz w:val="20"/>
           <w:szCs w:val="20"/>
         </w:rPr>
-        <w:t xml:space="preserve">Chaining as described consults only the declared capabilities of the deployed agents. It never observes the task, and therefore derives an identical team for a question requiring arithmetic and one requiring none. To address this, a task is profiled into the set R of requirement markers it raises, and an agent earns inclusion only by being necessary to reach the goal or by satisfying a marker in R. Formation then searches for the smallest agent set satisfying Equation (4), and orders that set by the rule already established.</w:t>
+        <w:t xml:space="preserve">Chaining as described consults only the declared capabilities of the deployed agents. It never observes the task, and therefore derives an identical team for a question requiring arithmetic and one requiring none. To address this, a task is profiled into the set R of requirement markers it raises, and an agent earns inclusion only by being necessary to reach the goal or by satisfying a marker in R. Formation then searches for the smallest agent set satisfying Equation (4), and orders that set by the rule already established; Figure 2 summarises the runtime workflow.</w:t>
       </w:r>
     </w:p>
     <w:p>
@@ -1948,7 +1948,7 @@
           <w:sz w:val="20"/>
           <w:szCs w:val="20"/>
         </w:rPr>
-        <w:t xml:space="preserve">T* = arg min |T|  s.t.  goal ∈ A(T)  ∧  R ⊆ ∪ₐ₊ₜ Sₐ</w:t>
+        <w:t xml:space="preserve">T* = arg min_T |T|  s.t.  goal ∈ A(T)  ∧  R ⊆ ⋃_{a∈T} S_a</w:t>
       </w:r>
       <w:r>
         <w:rPr>
@@ -2037,7 +2037,7 @@
           <w:sz w:val="20"/>
           <w:szCs w:val="20"/>
         </w:rPr>
-        <w:t xml:space="preserve">Four deployment scenarios were used: a baseline of three agents; a fourth agent deployed after the system was written; withdrawal of a middle agent in the chain; and withdrawal of the entry agent. Fourteen tasks were used: three requiring a single retrieved fact, two requiring synthesis across documents, five requiring arithmetic the corpus does not state, two presenting a claim to be checked against the corpus, and two whose answers are absent from the corpus altogether. The full design is therefore four conditions by four scenarios by fourteen tasks, giving 224 trials.</w:t>
+        <w:t xml:space="preserve">Four deployment scenarios were used: a baseline of three agents; a fourth agent deployed after the system was written; withdrawal of a middle agent in the chain; and withdrawal of the entry agent. Fourteen tasks were used: three requiring a single retrieved fact, two requiring synthesis across documents, five requiring arithmetic the corpus does not state, two presenting a claim to be checked against the corpus, and two whose answers are absent from the corpus altogether. The full design is therefore four conditions by four scenarios by fourteen tasks, giving 224 trials. Mid-execution failures were evaluated separately as supplementary case studies (Tables 6-7 and Figures 5-7) and are not part of this 224-trial factorial design.</w:t>
       </w:r>
     </w:p>
     <w:p>
@@ -2166,9 +2166,9 @@
       <w:r>
         <w:drawing>
           <wp:inline distT="0" distB="0" distL="0" distR="0">
-            <wp:extent cx="6362700" cy="3724275"/>
+            <wp:extent cx="6362700" cy="2533650"/>
             <wp:effectExtent t="0" r="0" b="0" l="0"/>
-            <wp:docPr id="1" name="" descr="" title=""/>
+            <wp:docPr id="1" name="figure_task_aware_workflow.png" descr="Flow from task text through requirement profiling, capability discovery, team search and ordering to either execution or explicit impossibility report." title="Figure 2. Task-aware runtime formation workflow: requirement profiling, capability discovery, minimum-cardinality team search, deterministic ordering, then execution or explicit impossibility reporting."/>
             <wp:cNvGraphicFramePr>
               <a:graphicFrameLocks xmlns:a="http://schemas.openxmlformats.org/drawingml/2006/main" noChangeAspect="1"/>
             </wp:cNvGraphicFramePr>
@@ -2191,6 +2191,80 @@
                   <pic:spPr bwMode="auto">
                     <a:xfrm>
                       <a:off x="0" y="0"/>
+                      <a:ext cx="6362700" cy="2533650"/>
+                    </a:xfrm>
+                    <a:prstGeom prst="rect">
+                      <a:avLst/>
+                    </a:prstGeom>
+                  </pic:spPr>
+                </pic:pic>
+              </a:graphicData>
+            </a:graphic>
+          </wp:inline>
+        </w:drawing>
+      </w:r>
+    </w:p>
+    <w:p>
+      <w:pPr>
+        <w:spacing w:after="180"/>
+        <w:jc w:val="center"/>
+      </w:pPr>
+      <w:r>
+        <w:rPr>
+          <w:rFonts w:ascii="Times New Roman" w:cs="Times New Roman" w:eastAsia="Times New Roman" w:hAnsi="Times New Roman"/>
+          <w:b/>
+          <w:bCs/>
+          <w:color w:val="1F4E79"/>
+          <w:sz w:val="17"/>
+          <w:szCs w:val="17"/>
+        </w:rPr>
+        <w:t xml:space="preserve">Figure 2. Task-aware runtime formation workflow: requirement profiling, capability discovery, minimum-cardinality team search, deterministic ordering, then execution or explicit impossibility reporting.</w:t>
+      </w:r>
+    </w:p>
+    <w:p>
+      <w:pPr>
+        <w:sectPr>
+          <w:type w:val="continuous"/>
+          <w:pgSz w:w="12240" w:h="15840" w:orient="portrait"/>
+          <w:pgMar w:top="1100" w:right="1100" w:bottom="1100" w:left="1100" w:header="708" w:footer="708" w:gutter="0"/>
+          <w:pgNumType/>
+          <w:docGrid w:linePitch="360"/>
+        </w:sectPr>
+      </w:pPr>
+    </w:p>
+    <w:p>
+      <w:pPr>
+        <w:spacing w:after="80" w:before="200"/>
+        <w:jc w:val="center"/>
+      </w:pPr>
+      <w:r>
+        <w:drawing>
+          <wp:inline distT="0" distB="0" distL="0" distR="0">
+            <wp:extent cx="6362700" cy="3724275"/>
+            <wp:effectExtent t="0" r="0" b="0" l="0"/>
+            <wp:docPr id="1" name="figure_formation.png" descr="Same deployment yielding different teams for retrieval-only and computation tasks." title="Figure 3 team formation by task"/>
+            <wp:cNvGraphicFramePr>
+              <a:graphicFrameLocks xmlns:a="http://schemas.openxmlformats.org/drawingml/2006/main" noChangeAspect="1"/>
+            </wp:cNvGraphicFramePr>
+            <a:graphic xmlns:a="http://schemas.openxmlformats.org/drawingml/2006/main">
+              <a:graphicData uri="http://schemas.openxmlformats.org/drawingml/2006/picture">
+                <pic:pic xmlns:pic="http://schemas.openxmlformats.org/drawingml/2006/picture">
+                  <pic:nvPicPr>
+                    <pic:cNvPr id="0" name="" descr=""/>
+                    <pic:cNvPicPr>
+                      <a:picLocks noChangeAspect="1" noChangeArrowheads="1"/>
+                    </pic:cNvPicPr>
+                  </pic:nvPicPr>
+                  <pic:blipFill>
+                    <a:blip r:embed="rId9" cstate="none"/>
+                    <a:srcRect/>
+                    <a:stretch>
+                      <a:fillRect/>
+                    </a:stretch>
+                  </pic:blipFill>
+                  <pic:spPr bwMode="auto">
+                    <a:xfrm>
+                      <a:off x="0" y="0"/>
                       <a:ext cx="6362700" cy="3724275"/>
                     </a:xfrm>
                     <a:prstGeom prst="rect">
@@ -2218,7 +2292,7 @@
           <w:sz w:val="17"/>
           <w:szCs w:val="17"/>
         </w:rPr>
-        <w:t xml:space="preserve">Figure 2. The same deployment yielding different teams for two tasks. Membership is decided by the requirements the task raises, not by which agents happen to be eligible.</w:t>
+        <w:t xml:space="preserve">Figure 3. The same deployment yielding different teams for two tasks. Membership is decided by the requirements the task raises, not by which agents happen to be eligible.</w:t>
       </w:r>
     </w:p>
     <w:p>
@@ -3099,7 +3173,7 @@
           <w:sz w:val="20"/>
           <w:szCs w:val="20"/>
         </w:rPr>
-        <w:t xml:space="preserve">Table 3 reports the headline comparison. The static team and task-blind formation are separated by no single measure that favours formation unambiguously; the static team is in fact the more precise of the two. Task-aware formation dominates both.</w:t>
+        <w:t xml:space="preserve">Table 3 reports the headline comparison, while Table 4 reports completion counts by scenario and Figure 4 summarises why the three composition strategies diverge. The static team and task-blind formation are separated by no single measure that favours formation unambiguously; the static team is in fact the more precise of the two. Task-aware formation dominates both.</w:t>
       </w:r>
     </w:p>
     <w:p>
@@ -3116,7 +3190,54 @@
     </w:p>
     <w:p>
       <w:pPr>
-        <w:spacing w:after="80" w:before="160"/>
+        <w:spacing w:after="80" w:before="200"/>
+        <w:jc w:val="center"/>
+      </w:pPr>
+      <w:r>
+        <w:drawing>
+          <wp:inline distT="0" distB="0" distL="0" distR="0">
+            <wp:extent cx="6362700" cy="3286125"/>
+            <wp:effectExtent t="0" r="0" b="0" l="0"/>
+            <wp:docPr id="1" name="figure_strategy_comparison.png" descr="Three-column comparison of composition strategies across source edits, recruitment behaviour and failure reporting." title="Figure 4. Comparison of static composition, task-blind formation and task-aware formation. The contrast highlights source-edit burden, unnecessary recruitment and explicit impossibility reporting."/>
+            <wp:cNvGraphicFramePr>
+              <a:graphicFrameLocks xmlns:a="http://schemas.openxmlformats.org/drawingml/2006/main" noChangeAspect="1"/>
+            </wp:cNvGraphicFramePr>
+            <a:graphic xmlns:a="http://schemas.openxmlformats.org/drawingml/2006/main">
+              <a:graphicData uri="http://schemas.openxmlformats.org/drawingml/2006/picture">
+                <pic:pic xmlns:pic="http://schemas.openxmlformats.org/drawingml/2006/picture">
+                  <pic:nvPicPr>
+                    <pic:cNvPr id="0" name="" descr=""/>
+                    <pic:cNvPicPr>
+                      <a:picLocks noChangeAspect="1" noChangeArrowheads="1"/>
+                    </pic:cNvPicPr>
+                  </pic:nvPicPr>
+                  <pic:blipFill>
+                    <a:blip r:embed="rId10" cstate="none"/>
+                    <a:srcRect/>
+                    <a:stretch>
+                      <a:fillRect/>
+                    </a:stretch>
+                  </pic:blipFill>
+                  <pic:spPr bwMode="auto">
+                    <a:xfrm>
+                      <a:off x="0" y="0"/>
+                      <a:ext cx="6362700" cy="3286125"/>
+                    </a:xfrm>
+                    <a:prstGeom prst="rect">
+                      <a:avLst/>
+                    </a:prstGeom>
+                  </pic:spPr>
+                </pic:pic>
+              </a:graphicData>
+            </a:graphic>
+          </wp:inline>
+        </w:drawing>
+      </w:r>
+    </w:p>
+    <w:p>
+      <w:pPr>
+        <w:spacing w:after="180"/>
+        <w:jc w:val="center"/>
       </w:pPr>
       <w:r>
         <w:rPr>
@@ -3127,7 +3248,34 @@
           <w:sz w:val="17"/>
           <w:szCs w:val="17"/>
         </w:rPr>
-        <w:t xml:space="preserve">Table 3. Formation quality by condition, over 224 trials. Precision and recall are means over completing trials.</w:t>
+        <w:t xml:space="preserve">Figure 4. Comparison of static composition, task-blind formation and task-aware formation. The contrast highlights source-edit burden, unnecessary recruitment and explicit impossibility reporting.</w:t>
+      </w:r>
+    </w:p>
+    <w:p>
+      <w:pPr>
+        <w:sectPr>
+          <w:type w:val="continuous"/>
+          <w:pgSz w:w="12240" w:h="15840" w:orient="portrait"/>
+          <w:pgMar w:top="1100" w:right="1100" w:bottom="1100" w:left="1100" w:header="708" w:footer="708" w:gutter="0"/>
+          <w:pgNumType/>
+          <w:docGrid w:linePitch="360"/>
+        </w:sectPr>
+      </w:pPr>
+    </w:p>
+    <w:p>
+      <w:pPr>
+        <w:spacing w:after="80" w:before="160"/>
+      </w:pPr>
+      <w:r>
+        <w:rPr>
+          <w:rFonts w:ascii="Times New Roman" w:cs="Times New Roman" w:eastAsia="Times New Roman" w:hAnsi="Times New Roman"/>
+          <w:b/>
+          <w:bCs/>
+          <w:color w:val="1F4E79"/>
+          <w:sz w:val="17"/>
+          <w:szCs w:val="17"/>
+        </w:rPr>
+        <w:t xml:space="preserve">Table 3. Formation quality by condition, over 224 trials. Precision and recall are macro-averaged over applicable completed trials only; completion and failure counts are reported separately in Table 4.</w:t>
       </w:r>
     </w:p>
     <w:tbl>
@@ -5522,7 +5670,7 @@
           <w:sz w:val="20"/>
           <w:szCs w:val="20"/>
         </w:rPr>
-        <w:t xml:space="preserve">Separating the two changes made to the mechanism shows where the improvement originates. Loosening the writer agent's declaration, which had previously required conclusions and thereby forced the analysis agent into every chain, raises precision from 0.705 to 0.804 but lowers recall from 0.976 to 0.929. Task-awareness is what carries precision to 1.000 while restoring recall to 1.000, and reduces the mean team to 2.36 agents. Table 5 shows the mechanism at work: teams differ by task, and match the pre-registered requirement sets exactly.</w:t>
+        <w:t xml:space="preserve">Separating the two changes made to the mechanism shows where the improvement originates. Loosening the writer agent's declaration, which had previously required conclusions and thereby forced the analysis agent into every chain, raises precision from 0.705 to 0.804 but lowers recall from 0.976 to 0.929. Task-awareness is what carries precision to 1.000 while restoring recall to 1.000, and reduces the mean team to 2.36 agents. Table 5 shows the mechanism at work: teams differ by task, and match the requirement sets fixed before any result was observed.</w:t>
       </w:r>
     </w:p>
     <w:p>
@@ -5581,7 +5729,7 @@
           <w:sz w:val="20"/>
           <w:szCs w:val="20"/>
         </w:rPr>
-        <w:t xml:space="preserve">Two cases were used, chosen because they should behave differently. In the first the withdrawn agent is the only one satisfying a requirement the task raised, so no recovery is possible and the question is only whether that is reported or merely crashed into. In the second a second agent satisfying the same requirement is also deployed, so recovery is possible and the conditions can separate. Results appear in Table 6 and Figure 3.</w:t>
+        <w:t xml:space="preserve">Two cases were used, chosen because they should behave differently. In the first the withdrawn agent is the only one satisfying a requirement the task raised, so no recovery is possible and the question is only whether that is reported or merely crashed into. In the second a second agent satisfying the same requirement is also deployed, so recovery is possible and the conditions can separate. Results appear in Table 6 and Figure 5.</w:t>
       </w:r>
     </w:p>
     <w:p>
@@ -5988,7 +6136,7 @@
           <wp:inline distT="0" distB="0" distL="0" distR="0">
             <wp:extent cx="6362700" cy="3238500"/>
             <wp:effectExtent t="0" r="0" b="0" l="0"/>
-            <wp:docPr id="1" name="" descr="" title=""/>
+            <wp:docPr id="1" name="figure_withdrawal.png" descr="Two execution cases under mid-run withdrawal: irrecoverable sole satisfier and recoverable redundant satisfier." title="Figure 5. Withdrawal of an agent during execution, under a fixed plan and under re-formation. Recovery is possible only where a second agent satisfies the same requirement."/>
             <wp:cNvGraphicFramePr>
               <a:graphicFrameLocks xmlns:a="http://schemas.openxmlformats.org/drawingml/2006/main" noChangeAspect="1"/>
             </wp:cNvGraphicFramePr>
@@ -6002,7 +6150,7 @@
                     </pic:cNvPicPr>
                   </pic:nvPicPr>
                   <pic:blipFill>
-                    <a:blip r:embed="rId9" cstate="none"/>
+                    <a:blip r:embed="rId11" cstate="none"/>
                     <a:srcRect/>
                     <a:stretch>
                       <a:fillRect/>
@@ -6038,7 +6186,7 @@
           <w:sz w:val="17"/>
           <w:szCs w:val="17"/>
         </w:rPr>
-        <w:t xml:space="preserve">Figure 3. Withdrawal of an agent during execution, under a fixed plan and under re-formation. Recovery is possible only where a second agent satisfies the same requirement.</w:t>
+        <w:t xml:space="preserve">Figure 5. Withdrawal of an agent during execution, under a fixed plan and under re-formation. Recovery is possible only where a second agent satisfies the same requirement.</w:t>
       </w:r>
     </w:p>
     <w:p>
@@ -6091,7 +6239,7 @@
           <w:sz w:val="20"/>
           <w:szCs w:val="20"/>
         </w:rPr>
-        <w:t xml:space="preserve">Detection was immediate in all trials, at less than one hundredth of a second, because a withdrawn process refuses the connection outright. This figure should not be generalised: an agent that remains reachable but stops responding would not be detected until a timeout expired, and that case was not tested.</w:t>
+        <w:t xml:space="preserve">Detection was immediate in all trials, at less than one hundredth of a second, because a withdrawn process refuses the connection outright. This figure should not be generalised: an agent that remains reachable but stops responding is detected only when the caller timeout expires, and that separate case-study is reported in Table 7, Figure 6 and Figure 7.</w:t>
       </w:r>
     </w:p>
     <w:p>
@@ -6136,7 +6284,7 @@
           <w:sz w:val="20"/>
           <w:szCs w:val="20"/>
         </w:rPr>
-        <w:t xml:space="preserve">The result is reported in Table 7 and drawn in Figure 4. In all four trials the agent's card endpoint continued to serve while the agent performed no work whatsoever. The readiness probe defined in the deployment manifests fetches exactly that endpoint, so the platform's own health signal reported the agent as ready throughout, the pod was retained in its Service, discovery continued to return it, and formation continued to select it. Detection occurred at 8.0 seconds in every trial, which is to say at precisely the timeout configured by the caller and not a moment sooner.</w:t>
+        <w:t xml:space="preserve">The result is reported in Table 7 and drawn in Figure 6. In all four trials the agent's card endpoint continued to serve while the agent performed no work whatsoever. The readiness probe defined in the deployment manifests fetches exactly that endpoint, so the platform's own health signal reported the agent as ready throughout, the pod was retained in its Service, discovery continued to return it, and formation continued to select it. Detection occurred at 8.0 seconds in every trial, which is to say at precisely the timeout configured by the caller and not a moment sooner.</w:t>
       </w:r>
     </w:p>
     <w:p>
@@ -6164,7 +6312,7 @@
           <w:sz w:val="20"/>
           <w:szCs w:val="20"/>
         </w:rPr>
-        <w:t xml:space="preserve">Re-formation behaves as it does under withdrawal once the timeout has expired. Where a second agent satisfies the same requirement the run recovers, re-forming as compute to writer from the material already held; where none does, the task is declined with the unsatisfiable requirement named. The mechanism is therefore indifferent to which of the two failure modes occurred, and only the delay before it is invoked differs.</w:t>
+        <w:t xml:space="preserve">Re-formation behaves as it does under withdrawal once the timeout has expired. Where a second agent satisfies the same requirement the run recovers, re-forming as compute to writer from the material already held; where none does, the task is declined with the unsatisfiable requirement named. The mechanism is therefore indifferent to which of the two failure modes occurred, and only the delay before it is invoked differs; Figure 7 summarises this shared lifecycle.</w:t>
       </w:r>
     </w:p>
     <w:p>
@@ -6935,7 +7083,7 @@
           <wp:inline distT="0" distB="0" distL="0" distR="0">
             <wp:extent cx="6362700" cy="3028950"/>
             <wp:effectExtent t="0" r="0" b="0" l="0"/>
-            <wp:docPr id="1" name="" descr="" title=""/>
+            <wp:docPr id="1" name="figure_failure_modes.png" descr="Side-by-side comparison of withdrawn versus stalled agent behaviour and what Kubernetes and caller signals observe." title="Figure 6. The two ways an agent fails, and what each is visible to. A withdrawn process is detected by every signal at once; an unresponsive one passes its readiness probe throughout and is detected only when the caller's timeout expires."/>
             <wp:cNvGraphicFramePr>
               <a:graphicFrameLocks xmlns:a="http://schemas.openxmlformats.org/drawingml/2006/main" noChangeAspect="1"/>
             </wp:cNvGraphicFramePr>
@@ -6949,7 +7097,7 @@
                     </pic:cNvPicPr>
                   </pic:nvPicPr>
                   <pic:blipFill>
-                    <a:blip r:embed="rId10" cstate="none"/>
+                    <a:blip r:embed="rId12" cstate="none"/>
                     <a:srcRect/>
                     <a:stretch>
                       <a:fillRect/>
@@ -6985,7 +7133,70 @@
           <w:sz w:val="17"/>
           <w:szCs w:val="17"/>
         </w:rPr>
-        <w:t xml:space="preserve">Figure 4. The two ways an agent fails, and what each is visible to. A withdrawn process is detected by every signal at once; an unresponsive one passes its readiness probe throughout and is detected only when the caller's timeout expires.</w:t>
+        <w:t xml:space="preserve">Figure 6. The two ways an agent fails, and what each is visible to. A withdrawn process is detected by every signal at once; an unresponsive one passes its readiness probe throughout and is detected only when the caller's timeout expires.</w:t>
+      </w:r>
+    </w:p>
+    <w:p>
+      <w:pPr>
+        <w:spacing w:after="80" w:before="200"/>
+        <w:jc w:val="center"/>
+      </w:pPr>
+      <w:r>
+        <w:drawing>
+          <wp:inline distT="0" distB="0" distL="0" distR="0">
+            <wp:extent cx="6362700" cy="2533650"/>
+            <wp:effectExtent t="0" r="0" b="0" l="0"/>
+            <wp:docPr id="1" name="figure_lifecycle_recovery.png" descr="Lifecycle diagram showing detection of withdrawal or timeout and branch to recovery or explicit decline after re-formation." title="Figure 7. Compact execution lifecycle under failures: discovery, execution, timeout or withdrawal detection, re-formation, then recovery or explicit decline."/>
+            <wp:cNvGraphicFramePr>
+              <a:graphicFrameLocks xmlns:a="http://schemas.openxmlformats.org/drawingml/2006/main" noChangeAspect="1"/>
+            </wp:cNvGraphicFramePr>
+            <a:graphic xmlns:a="http://schemas.openxmlformats.org/drawingml/2006/main">
+              <a:graphicData uri="http://schemas.openxmlformats.org/drawingml/2006/picture">
+                <pic:pic xmlns:pic="http://schemas.openxmlformats.org/drawingml/2006/picture">
+                  <pic:nvPicPr>
+                    <pic:cNvPr id="0" name="" descr=""/>
+                    <pic:cNvPicPr>
+                      <a:picLocks noChangeAspect="1" noChangeArrowheads="1"/>
+                    </pic:cNvPicPr>
+                  </pic:nvPicPr>
+                  <pic:blipFill>
+                    <a:blip r:embed="rId13" cstate="none"/>
+                    <a:srcRect/>
+                    <a:stretch>
+                      <a:fillRect/>
+                    </a:stretch>
+                  </pic:blipFill>
+                  <pic:spPr bwMode="auto">
+                    <a:xfrm>
+                      <a:off x="0" y="0"/>
+                      <a:ext cx="6362700" cy="2533650"/>
+                    </a:xfrm>
+                    <a:prstGeom prst="rect">
+                      <a:avLst/>
+                    </a:prstGeom>
+                  </pic:spPr>
+                </pic:pic>
+              </a:graphicData>
+            </a:graphic>
+          </wp:inline>
+        </w:drawing>
+      </w:r>
+    </w:p>
+    <w:p>
+      <w:pPr>
+        <w:spacing w:after="180"/>
+        <w:jc w:val="center"/>
+      </w:pPr>
+      <w:r>
+        <w:rPr>
+          <w:rFonts w:ascii="Times New Roman" w:cs="Times New Roman" w:eastAsia="Times New Roman" w:hAnsi="Times New Roman"/>
+          <w:b/>
+          <w:bCs/>
+          <w:color w:val="1F4E79"/>
+          <w:sz w:val="17"/>
+          <w:szCs w:val="17"/>
+        </w:rPr>
+        <w:t xml:space="preserve">Figure 7. Compact execution lifecycle under failures: discovery, execution, timeout or withdrawal detection, re-formation, then recovery or explicit decline.</w:t>
       </w:r>
     </w:p>
     <w:p>
@@ -7074,7 +7285,7 @@
           <w:sz w:val="20"/>
           <w:szCs w:val="20"/>
         </w:rPr>
-        <w:t xml:space="preserve">The finding with the broadest implication is that completion is an inadequate measure for these systems. Under withdrawal of the analysis agent, the condition completing more tasks is the condition behaving worse. This aligns with the multi-agent failure literature, in which the largest failure category concerns verification rather than execution, and systems report success while returning unreliable results [ref]. Formation offers a partial defence not available to a static team: because membership is decided before execution and against a stated requirement, a task whose requirements cannot be met is identifiable in advance rather than after the fact.</w:t>
+        <w:t xml:space="preserve">The finding with the broadest implication is that completion is an inadequate measure for these systems. Under withdrawal of the analysis agent, the condition completing more tasks is the condition behaving worse. This aligns with the multi-agent failure literature, which includes task-verification failures in which systems report success while returning unreliable results [ref]. Formation offers a partial defence not available to a static team: because membership is decided before execution and against a stated requirement, a task whose requirements cannot be met is identifiable in advance rather than after the fact.</w:t>
       </w:r>
     </w:p>
     <w:p>
@@ -7088,7 +7299,7 @@
           <w:sz w:val="20"/>
           <w:szCs w:val="20"/>
         </w:rPr>
-        <w:t xml:space="preserve">Several limitations bound these results. The task profiler is a keyword matcher, chosen so that formation remains free of inference and therefore exactly measurable; it will not generalise to unusually phrased tasks, and a model-based profiler is the natural successor, though it would require a different evaluation design, since composition would cease to be exact and would have to be sampled. The task set comprises fourteen tasks over a four-document corpus. It exercises both requirement markers and separates the conditions, but it does not characterise the profiler's coverage over arbitrary phrasing. Requirement markers are declared by the author of each agent, so a miscategorised agent produces a miscategorised team, and nothing verifies a declaration against behaviour. Both failure modes during execution were tested. What remains untested is a partial failure, in which an agent returns promptly but returns something wrong; no signal in this system would register that at all, and the multi-agent failure literature identifies it as the largest failure category. Finally, answer quality under real inference was confirmed to be functional but was not measured, so the effect of team composition on the quality of the final answer remains open.</w:t>
+        <w:t xml:space="preserve">Several limitations bound these results. The task profiler is a keyword matcher, chosen so that formation remains free of inference and therefore exactly measurable; it will not generalise to unusually phrased tasks, and a model-based profiler is the natural successor, though it would require a different evaluation design, since composition would cease to be exact and would have to be sampled. The task set comprises fourteen tasks over a four-document corpus. It exercises both requirement markers and separates the conditions, but it does not characterise the profiler's coverage over arbitrary phrasing. Requirement markers are declared by the author of each agent, so a miscategorised agent produces a miscategorised team, and nothing verifies a declaration against behaviour. The perfect precision and recall reported for the task-aware condition therefore demonstrate behaviour on this constructed, author-defined evaluation rather than generalisation to arbitrary tasks. Mid-execution withdrawal and stalled-agent failures were tested; a partial failure, in which an agent returns promptly but returns something wrong, remains untested and would not be detected by any current health signal. Finally, answer quality under real inference was confirmed to be functional but was not measured, so the effect of team composition on the quality of the final answer remains open.</w:t>
       </w:r>
     </w:p>
     <w:p>

</xml_diff>

<commit_message>
Revise manuscript text, equations, and explanatory figures
Co-authored-by: Davidic-02 <200108830+Davidic-02@users.noreply.github.com>
</commit_message>
<xml_diff>
--- a/manuscript/Chapter_RuntimeTeamFormation.docx
+++ b/manuscript/Chapter_RuntimeTeamFormation.docx
@@ -79,7 +79,7 @@
           <w:sz w:val="20"/>
           <w:szCs w:val="20"/>
         </w:rPr>
-        <w:t xml:space="preserve">Agentic applications increasingly decompose a task across several specialised agents, but the composition of those agents is almost always fixed when the system is written. Cloud-native deployment makes that assumption unsound: agents are independently deployed services that scale, fail and appear while the system is running, so a team enumerated in source contradicts the environment it runs in. This chapter presents an agentic document-research system in which four specialised agents communicate through the Agent2Agent protocol, reach their tools through the Model Context Protocol, and run as independent workloads on Kubernetes; and it replaces the hardcoded team with formation performed at run time. Agents advertise consumed and produced information types in their A2A capability cards, and a coordinator derives both the membership and the ordering of a team by chaining those declarations. Formation was evaluated across four conditions, four deployment scenarios and fourteen tasks, giving 224 trials; because formation performs no model inference, the measurements are exact rather than sampled, and per-task ground truth was fixed before any result was observed. The first mechanism proved less precise than the static team it replaced, scoring 0.705 against 0.786, because formation never observed the task and therefore recruited every runnable agent irrespective of need. Introducing requirement markers, by which a task is profiled for the needs it raises and an agent earns inclusion only by necessity or by satisfying a marker, raised precision to 1.000 with perfect recall and reduced the mean team from 3.50 to 2.36 agents, with no source modification across any scenario. The clearest evidence for the mechanism is a reduction in completions: when the analysis agent is withdrawn, task-blind formation answers arithmetic questions using a team containing no arithmetic agent and reports success, whereas task-aware formation reports those tasks as impossible and names the absent capability.</w:t>
+        <w:t xml:space="preserve">Agentic applications increasingly decompose a task across several specialised agents, but the composition of those agents is almost always fixed when the system is written. Cloud-native deployment makes that assumption unsound: agents are independently deployed services that scale, fail and appear while the system is running, so a team enumerated in source contradicts the environment it runs in. This chapter presents an agentic document-research system in which four specialised agents communicate through the Agent2Agent protocol, reach their tools through the Model Context Protocol, and run as independent workloads on Kubernetes; and it replaces the hardcoded team with formation performed at run time. Agents advertise consumed and produced information types in their A2A capability cards, and a coordinator derives both the membership and the ordering of a team by chaining those declarations. Formation was evaluated across four conditions, four deployment scenarios and fourteen tasks, giving 224 trials; because formation performs no model inference, the measurements are exact rather than sampled, and per-task ground truth was fixed before any result was observed. These factorial trials cover pre-execution deployment scenarios; separate case studies then test mid-execution withdrawal and stalled-but-reachable agents. The first mechanism proved less precise than the static team it replaced, scoring 0.705 against 0.786, because formation never observed the task and therefore recruited every runnable agent irrespective of need. Introducing requirement markers, by which a task is profiled for the needs it raises and an agent earns inclusion only by necessity or by satisfying a marker, raised precision to 1.000 with perfect recall and reduced the mean team from 3.50 to 2.36 agents, with no source modification across any scenario. The clearest evidence for the mechanism is a reduction in completions: when the analysis agent is withdrawn, task-blind formation answers arithmetic questions using a team containing no arithmetic agent and reports success, whereas task-aware formation reports those tasks as impossible and names the absent capability.</w:t>
       </w:r>
     </w:p>
     <w:p>
@@ -843,6 +843,119 @@
                 <w:szCs w:val="17"/>
               </w:rPr>
               <w:t xml:space="preserve">Descriptive; no mechanism proposed over the advertised information</w:t>
+            </w:r>
+          </w:p>
+        </w:tc>
+      </w:tr>
+      <w:tr>
+        <w:trPr>
+          <w:tblHeader w:val="false"/>
+        </w:trPr>
+        <w:tc>
+          <w:tcPr>
+            <w:tcW w:type="dxa" w:w="2050"/>
+            <w:tcMar>
+              <w:top w:type="dxa" w:w="40"/>
+              <w:left w:type="dxa" w:w="80"/>
+              <w:bottom w:type="dxa" w:w="40"/>
+              <w:right w:type="dxa" w:w="80"/>
+            </w:tcMar>
+          </w:tcPr>
+          <w:p>
+            <w:pPr>
+              <w:spacing w:after="0" w:line="220"/>
+              <w:jc w:val="left"/>
+            </w:pPr>
+            <w:r>
+              <w:rPr>
+                <w:rFonts w:ascii="Times New Roman" w:cs="Times New Roman" w:eastAsia="Times New Roman" w:hAnsi="Times New Roman"/>
+                <w:b w:val="false"/>
+                <w:bCs w:val="false"/>
+                <w:sz w:val="17"/>
+                <w:szCs w:val="17"/>
+              </w:rPr>
+              <w:t xml:space="preserve">AgentMaster framework [ref]</w:t>
+            </w:r>
+          </w:p>
+        </w:tc>
+        <w:tc>
+          <w:tcPr>
+            <w:tcW w:type="dxa" w:w="2750"/>
+            <w:tcMar>
+              <w:top w:type="dxa" w:w="40"/>
+              <w:left w:type="dxa" w:w="80"/>
+              <w:bottom w:type="dxa" w:w="40"/>
+              <w:right w:type="dxa" w:w="80"/>
+            </w:tcMar>
+          </w:tcPr>
+          <w:p>
+            <w:pPr>
+              <w:spacing w:after="0" w:line="220"/>
+              <w:jc w:val="left"/>
+            </w:pPr>
+            <w:r>
+              <w:rPr>
+                <w:rFonts w:ascii="Times New Roman" w:cs="Times New Roman" w:eastAsia="Times New Roman" w:hAnsi="Times New Roman"/>
+                <w:b w:val="false"/>
+                <w:bCs w:val="false"/>
+                <w:sz w:val="17"/>
+                <w:szCs w:val="17"/>
+              </w:rPr>
+              <w:t xml:space="preserve">Demonstrates A2A+MCP integration for multi-agent retrieval and analysis</w:t>
+            </w:r>
+          </w:p>
+        </w:tc>
+        <w:tc>
+          <w:tcPr>
+            <w:tcW w:type="dxa" w:w="2200"/>
+            <w:tcMar>
+              <w:top w:type="dxa" w:w="40"/>
+              <w:left w:type="dxa" w:w="80"/>
+              <w:bottom w:type="dxa" w:w="40"/>
+              <w:right w:type="dxa" w:w="80"/>
+            </w:tcMar>
+          </w:tcPr>
+          <w:p>
+            <w:pPr>
+              <w:spacing w:after="0" w:line="220"/>
+              <w:jc w:val="left"/>
+            </w:pPr>
+            <w:r>
+              <w:rPr>
+                <w:rFonts w:ascii="Times New Roman" w:cs="Times New Roman" w:eastAsia="Times New Roman" w:hAnsi="Times New Roman"/>
+                <w:b w:val="false"/>
+                <w:bCs w:val="false"/>
+                <w:sz w:val="17"/>
+                <w:szCs w:val="17"/>
+              </w:rPr>
+              <w:t xml:space="preserve">Static</w:t>
+            </w:r>
+          </w:p>
+        </w:tc>
+        <w:tc>
+          <w:tcPr>
+            <w:tcW w:type="dxa" w:w="2900"/>
+            <w:tcMar>
+              <w:top w:type="dxa" w:w="40"/>
+              <w:left w:type="dxa" w:w="80"/>
+              <w:bottom w:type="dxa" w:w="40"/>
+              <w:right w:type="dxa" w:w="80"/>
+            </w:tcMar>
+          </w:tcPr>
+          <w:p>
+            <w:pPr>
+              <w:spacing w:after="0" w:line="220"/>
+              <w:jc w:val="left"/>
+            </w:pPr>
+            <w:r>
+              <w:rPr>
+                <w:rFonts w:ascii="Times New Roman" w:cs="Times New Roman" w:eastAsia="Times New Roman" w:hAnsi="Times New Roman"/>
+                <w:b w:val="false"/>
+                <w:bCs w:val="false"/>
+                <w:sz w:val="17"/>
+                <w:szCs w:val="17"/>
+              </w:rPr>
+              <w:t xml:space="preserve">Shows protocol integration, but team composition remains author-defined</w:t>
             </w:r>
           </w:p>
         </w:tc>
@@ -1690,7 +1803,7 @@
           <w:sz w:val="17"/>
           <w:szCs w:val="17"/>
         </w:rPr>
-        <w:t xml:space="preserve">Figure 1. System architecture. Agents are independently deployed workloads; A2A carries agent-to-agent traffic and MCP carries all tool access. The coordinator learns which agents exist by querying the cluster, not from its own source.</w:t>
+        <w:t xml:space="preserve">Figure 1. Task-aware runtime-formation workflow. The coordinator profiles the task for requirement markers, discovers capabilities from deployed agents, searches for the minimum team that reaches the goal while covering requirements, orders that team, and either executes or reports a missing capability.</w:t>
       </w:r>
     </w:p>
     <w:p>
@@ -1948,7 +2061,7 @@
           <w:sz w:val="20"/>
           <w:szCs w:val="20"/>
         </w:rPr>
-        <w:t xml:space="preserve">T* = arg min |T|  s.t.  goal ∈ A(T)  ∧  R ⊆ ∪ₐ₊ₜ Sₐ</w:t>
+        <w:t xml:space="preserve">T* = arg min_T |T|  s.t.  goal ∈ A(T)  ∧  R ⊆ ⋃_{a ∈ T} S_a</w:t>
       </w:r>
       <w:r>
         <w:rPr>
@@ -1965,6 +2078,20 @@
           <w:szCs w:val="20"/>
         </w:rPr>
         <w:t xml:space="preserve">(4)</w:t>
+      </w:r>
+    </w:p>
+    <w:p>
+      <w:pPr>
+        <w:spacing w:after="120" w:line="240"/>
+        <w:jc w:val="both"/>
+      </w:pPr>
+      <w:r>
+        <w:rPr>
+          <w:rFonts w:ascii="Times New Roman" w:cs="Times New Roman" w:eastAsia="Times New Roman" w:hAnsi="Times New Roman"/>
+          <w:sz w:val="20"/>
+          <w:szCs w:val="20"/>
+        </w:rPr>
+        <w:t xml:space="preserve">Figure 1 summarises the task-aware workflow from task text to requirement profiling, capability discovery, candidate-team search, ordering, and either execution or explicit impossibility reporting.</w:t>
       </w:r>
     </w:p>
     <w:p>
@@ -2037,7 +2164,7 @@
           <w:sz w:val="20"/>
           <w:szCs w:val="20"/>
         </w:rPr>
-        <w:t xml:space="preserve">Four deployment scenarios were used: a baseline of three agents; a fourth agent deployed after the system was written; withdrawal of a middle agent in the chain; and withdrawal of the entry agent. Fourteen tasks were used: three requiring a single retrieved fact, two requiring synthesis across documents, five requiring arithmetic the corpus does not state, two presenting a claim to be checked against the corpus, and two whose answers are absent from the corpus altogether. The full design is therefore four conditions by four scenarios by fourteen tasks, giving 224 trials.</w:t>
+        <w:t xml:space="preserve">Four deployment scenarios were used: a baseline of three agents; a fourth agent deployed after the system was written; withdrawal of a middle agent in the chain; and withdrawal of the entry agent. Fourteen tasks were used: three requiring a single retrieved fact, two requiring synthesis across documents, five requiring arithmetic the corpus does not state, two presenting a claim to be checked against the corpus, and two whose answers are absent from the corpus altogether. The full design is therefore four conditions by four scenarios by fourteen tasks, giving 224 trials. These 224 trials exclude the mid-execution withdrawal and stalled-agent case studies reported separately in Tables 6 and 7.</w:t>
       </w:r>
     </w:p>
     <w:p>
@@ -2218,7 +2345,7 @@
           <w:sz w:val="17"/>
           <w:szCs w:val="17"/>
         </w:rPr>
-        <w:t xml:space="preserve">Figure 2. The same deployment yielding different teams for two tasks. Membership is decided by the requirements the task raises, not by which agents happen to be eligible.</w:t>
+        <w:t xml:space="preserve">Figure 2. Static composition, task-blind formation, and task-aware formation on the same deployment. Task-aware formation avoids unnecessary agents, requires no source edits across deployment change, and reports impossibility explicitly when a required capability is absent.</w:t>
       </w:r>
     </w:p>
     <w:p>
@@ -3104,6 +3231,20 @@
     </w:p>
     <w:p>
       <w:pPr>
+        <w:spacing w:after="120" w:line="240"/>
+        <w:jc w:val="both"/>
+      </w:pPr>
+      <w:r>
+        <w:rPr>
+          <w:rFonts w:ascii="Times New Roman" w:cs="Times New Roman" w:eastAsia="Times New Roman" w:hAnsi="Times New Roman"/>
+          <w:sz w:val="20"/>
+          <w:szCs w:val="20"/>
+        </w:rPr>
+        <w:t xml:space="preserve">Figure 2 gives a compact behavioural comparison of static composition, task-blind formation and task-aware formation under the same deployed set.</w:t>
+      </w:r>
+    </w:p>
+    <w:p>
+      <w:pPr>
         <w:sectPr>
           <w:type w:val="continuous"/>
           <w:pgSz w:w="12240" w:h="15840" w:orient="portrait"/>
@@ -3127,7 +3268,7 @@
           <w:sz w:val="17"/>
           <w:szCs w:val="17"/>
         </w:rPr>
-        <w:t xml:space="preserve">Table 3. Formation quality by condition, over 224 trials. Precision and recall are means over completing trials.</w:t>
+        <w:t xml:space="preserve">Table 3. Formation quality by condition across the 224-trial factorial design. Precision and recall are computed per task over completing trials only; completion counts remain separate in Table 4, and runtime failures are reported in their own column here.</w:t>
       </w:r>
     </w:p>
     <w:tbl>
@@ -5522,7 +5663,7 @@
           <w:sz w:val="20"/>
           <w:szCs w:val="20"/>
         </w:rPr>
-        <w:t xml:space="preserve">Separating the two changes made to the mechanism shows where the improvement originates. Loosening the writer agent's declaration, which had previously required conclusions and thereby forced the analysis agent into every chain, raises precision from 0.705 to 0.804 but lowers recall from 0.976 to 0.929. Task-awareness is what carries precision to 1.000 while restoring recall to 1.000, and reduces the mean team to 2.36 agents. Table 5 shows the mechanism at work: teams differ by task, and match the pre-registered requirement sets exactly.</w:t>
+        <w:t xml:space="preserve">Separating the two changes made to the mechanism shows where the improvement originates. Loosening the writer agent's declaration, which had previously required conclusions and thereby forced the analysis agent into every chain, raises precision from 0.705 to 0.804 but lowers recall from 0.976 to 0.929. Task-awareness is what carries precision to 1.000 while restoring recall to 1.000, and reduces the mean team to 2.36 agents. Table 5 shows the mechanism at work: teams differ by task, and match the requirement sets fixed before any result was observed exactly.</w:t>
       </w:r>
     </w:p>
     <w:p>
@@ -6038,7 +6179,7 @@
           <w:sz w:val="17"/>
           <w:szCs w:val="17"/>
         </w:rPr>
-        <w:t xml:space="preserve">Figure 3. Withdrawal of an agent during execution, under a fixed plan and under re-formation. Recovery is possible only where a second agent satisfies the same requirement.</w:t>
+        <w:t xml:space="preserve">Figure 3. Lifecycle and failure handling during execution. After discovery and execution, withdrawal is detected immediately while stalled agents are detected at timeout; re-formation then recovers when redundancy exists, or declines explicitly when it does not.</w:t>
       </w:r>
     </w:p>
     <w:p>
@@ -6091,7 +6232,7 @@
           <w:sz w:val="20"/>
           <w:szCs w:val="20"/>
         </w:rPr>
-        <w:t xml:space="preserve">Detection was immediate in all trials, at less than one hundredth of a second, because a withdrawn process refuses the connection outright. This figure should not be generalised: an agent that remains reachable but stops responding would not be detected until a timeout expired, and that case was not tested.</w:t>
+        <w:t xml:space="preserve">Detection was immediate in all trials, at less than one hundredth of a second, because a withdrawn process refuses the connection outright. This figure should not be generalised: an agent that remains reachable but stops responding would not be detected until a timeout expired, and that stalled case was tested separately below.</w:t>
       </w:r>
     </w:p>
     <w:p>
@@ -7074,7 +7215,7 @@
           <w:sz w:val="20"/>
           <w:szCs w:val="20"/>
         </w:rPr>
-        <w:t xml:space="preserve">The finding with the broadest implication is that completion is an inadequate measure for these systems. Under withdrawal of the analysis agent, the condition completing more tasks is the condition behaving worse. This aligns with the multi-agent failure literature, in which the largest failure category concerns verification rather than execution, and systems report success while returning unreliable results [ref]. Formation offers a partial defence not available to a static team: because membership is decided before execution and against a stated requirement, a task whose requirements cannot be met is identifiable in advance rather than after the fact.</w:t>
+        <w:t xml:space="preserve">The finding with the broadest implication is that completion is an inadequate measure for these systems. Under withdrawal of the analysis agent, the condition completing more tasks is the condition behaving worse. This aligns with failure-taxonomy work reporting verification-related failures in which systems report success while returning unreliable results [ref]. Formation offers a partial defence not available to a static team: because membership is decided before execution and against a stated requirement, a task whose requirements cannot be met is identifiable in advance rather than after the fact.</w:t>
       </w:r>
     </w:p>
     <w:p>
@@ -7088,7 +7229,7 @@
           <w:sz w:val="20"/>
           <w:szCs w:val="20"/>
         </w:rPr>
-        <w:t xml:space="preserve">Several limitations bound these results. The task profiler is a keyword matcher, chosen so that formation remains free of inference and therefore exactly measurable; it will not generalise to unusually phrased tasks, and a model-based profiler is the natural successor, though it would require a different evaluation design, since composition would cease to be exact and would have to be sampled. The task set comprises fourteen tasks over a four-document corpus. It exercises both requirement markers and separates the conditions, but it does not characterise the profiler's coverage over arbitrary phrasing. Requirement markers are declared by the author of each agent, so a miscategorised agent produces a miscategorised team, and nothing verifies a declaration against behaviour. Both failure modes during execution were tested. What remains untested is a partial failure, in which an agent returns promptly but returns something wrong; no signal in this system would register that at all, and the multi-agent failure literature identifies it as the largest failure category. Finally, answer quality under real inference was confirmed to be functional but was not measured, so the effect of team composition on the quality of the final answer remains open.</w:t>
+        <w:t xml:space="preserve">Several limitations bound these results. The task profiler is a keyword matcher, chosen so that formation remains free of inference and therefore exactly measurable; it will not generalise to unusually phrased tasks, and a model-based profiler is the natural successor, though it would require a different evaluation design, since composition would cease to be exact and would have to be sampled. The task set comprises fourteen tasks over a four-document corpus. It exercises both requirement markers and separates the conditions, but it does not characterise the profiler's coverage over arbitrary phrasing. Requirement markers are declared by the author of each agent, so a miscategorised agent produces a miscategorised team, and nothing verifies a declaration against behaviour. The task-aware precision and recall scores are therefore best read as performance on this constructed evaluation, which combines author-defined requirement markers with a keyword profiler, not as evidence of generalisation to arbitrary tasks. Mid-execution withdrawal and stalled-unresponsive failures were both tested; what remains untested is a partial failure, in which an agent returns promptly but returns something wrong. Finally, answer quality under real inference was confirmed to be functional but was not measured, so the effect of team composition on the quality of the final answer remains open.</w:t>
       </w:r>
     </w:p>
     <w:p>

</xml_diff>